<commit_message>
Add group members to the CA4 report and export it as PDF
Co-Authored-By: Claude Opus 5.5 <noreply@anthropic.com>
</commit_message>
<xml_diff>
--- a/report/CA4_Result_Analysis_Report.docx
+++ b/report/CA4_Result_Analysis_Report.docx
@@ -124,8 +124,8 @@
     </w:p>
     <w:p>
       <w:pPr>
-        <w:spacing w:after="120" w:line="300"/>
-        <w:jc w:val="both"/>
+        <w:spacing w:after="40" w:line="300"/>
+        <w:jc w:val="left"/>
       </w:pPr>
       <w:r>
         <w:rPr>
@@ -135,8 +135,17 @@
           <w:sz w:val="24"/>
           <w:szCs w:val="24"/>
         </w:rPr>
-        <w:t xml:space="preserve">Name of students in a group: </w:t>
-      </w:r>
+        <w:t xml:space="preserve">Name of students in a group:</w:t>
+      </w:r>
+    </w:p>
+    <w:p>
+      <w:pPr>
+        <w:tabs>
+          <w:tab w:val="left" w:pos="4300"/>
+        </w:tabs>
+        <w:spacing w:after="40"/>
+        <w:ind w:left="360"/>
+      </w:pPr>
       <w:r>
         <w:rPr>
           <w:rFonts w:ascii="Times New Roman" w:cs="Times New Roman" w:eastAsia="Times New Roman" w:hAnsi="Times New Roman"/>
@@ -153,7 +162,7 @@
           <w:sz w:val="24"/>
           <w:szCs w:val="24"/>
         </w:rPr>
-        <w:t xml:space="preserve">          Roll No: </w:t>
+        <w:t xml:space="preserve">	Roll No: </w:t>
       </w:r>
       <w:r>
         <w:rPr>
@@ -161,7 +170,77 @@
           <w:sz w:val="24"/>
           <w:szCs w:val="24"/>
         </w:rPr>
-        <w:t xml:space="preserve">________</w:t>
+        <w:t xml:space="preserve">202301128055</w:t>
+      </w:r>
+    </w:p>
+    <w:p>
+      <w:pPr>
+        <w:tabs>
+          <w:tab w:val="left" w:pos="4300"/>
+        </w:tabs>
+        <w:spacing w:after="40"/>
+        <w:ind w:left="360"/>
+      </w:pPr>
+      <w:r>
+        <w:rPr>
+          <w:rFonts w:ascii="Times New Roman" w:cs="Times New Roman" w:eastAsia="Times New Roman" w:hAnsi="Times New Roman"/>
+          <w:sz w:val="24"/>
+          <w:szCs w:val="24"/>
+        </w:rPr>
+        <w:t xml:space="preserve">Rifa Khan</w:t>
+      </w:r>
+      <w:r>
+        <w:rPr>
+          <w:rFonts w:ascii="Times New Roman" w:cs="Times New Roman" w:eastAsia="Times New Roman" w:hAnsi="Times New Roman"/>
+          <w:b/>
+          <w:bCs/>
+          <w:sz w:val="24"/>
+          <w:szCs w:val="24"/>
+        </w:rPr>
+        <w:t xml:space="preserve">	Roll No: </w:t>
+      </w:r>
+      <w:r>
+        <w:rPr>
+          <w:rFonts w:ascii="Times New Roman" w:cs="Times New Roman" w:eastAsia="Times New Roman" w:hAnsi="Times New Roman"/>
+          <w:sz w:val="24"/>
+          <w:szCs w:val="24"/>
+        </w:rPr>
+        <w:t xml:space="preserve">202301128059</w:t>
+      </w:r>
+    </w:p>
+    <w:p>
+      <w:pPr>
+        <w:tabs>
+          <w:tab w:val="left" w:pos="4300"/>
+        </w:tabs>
+        <w:spacing w:after="40"/>
+        <w:ind w:left="360"/>
+      </w:pPr>
+      <w:r>
+        <w:rPr>
+          <w:rFonts w:ascii="Times New Roman" w:cs="Times New Roman" w:eastAsia="Times New Roman" w:hAnsi="Times New Roman"/>
+          <w:sz w:val="24"/>
+          <w:szCs w:val="24"/>
+        </w:rPr>
+        <w:t xml:space="preserve">Ayush Shinde</w:t>
+      </w:r>
+      <w:r>
+        <w:rPr>
+          <w:rFonts w:ascii="Times New Roman" w:cs="Times New Roman" w:eastAsia="Times New Roman" w:hAnsi="Times New Roman"/>
+          <w:b/>
+          <w:bCs/>
+          <w:sz w:val="24"/>
+          <w:szCs w:val="24"/>
+        </w:rPr>
+        <w:t xml:space="preserve">	Roll No: </w:t>
+      </w:r>
+      <w:r>
+        <w:rPr>
+          <w:rFonts w:ascii="Times New Roman" w:cs="Times New Roman" w:eastAsia="Times New Roman" w:hAnsi="Times New Roman"/>
+          <w:sz w:val="24"/>
+          <w:szCs w:val="24"/>
+        </w:rPr>
+        <w:t xml:space="preserve">202301128023</w:t>
       </w:r>
     </w:p>
     <w:p>

</xml_diff>

<commit_message>
Centre the CA4 report on the page with equal left/right margins
The format's 1440/707 DXA margins pushed the content to the right. The same
total is now split evenly (1074 each), so the text width is unchanged.

Co-Authored-By: Claude Opus 5.5 <noreply@anthropic.com>
</commit_message>
<xml_diff>
--- a/report/CA4_Result_Analysis_Report.docx
+++ b/report/CA4_Result_Analysis_Report.docx
@@ -722,7 +722,7 @@
     </w:p>
     <w:tbl>
       <w:tblPr>
-        <w:tblW w:type="dxa" w:w="9759"/>
+        <w:tblW w:type="dxa" w:w="9758"/>
         <w:tblBorders>
           <w:top w:val="single" w:color="auto" w:sz="4"/>
           <w:left w:val="single" w:color="auto" w:sz="4"/>
@@ -734,7 +734,7 @@
       </w:tblPr>
       <w:tblGrid>
         <w:gridCol w:w="3000"/>
-        <w:gridCol w:w="6759"/>
+        <w:gridCol w:w="6758"/>
       </w:tblGrid>
       <w:tr>
         <w:trPr>
@@ -775,7 +775,7 @@
         </w:tc>
         <w:tc>
           <w:tcPr>
-            <w:tcW w:type="dxa" w:w="6759"/>
+            <w:tcW w:type="dxa" w:w="6758"/>
             <w:tcBorders>
               <w:top w:val="single" w:color="000000" w:sz="4"/>
               <w:left w:val="single" w:color="000000" w:sz="4"/>
@@ -842,7 +842,7 @@
         </w:tc>
         <w:tc>
           <w:tcPr>
-            <w:tcW w:type="dxa" w:w="6759"/>
+            <w:tcW w:type="dxa" w:w="6758"/>
             <w:tcBorders>
               <w:top w:val="single" w:color="000000" w:sz="4"/>
               <w:left w:val="single" w:color="000000" w:sz="4"/>
@@ -908,7 +908,7 @@
         </w:tc>
         <w:tc>
           <w:tcPr>
-            <w:tcW w:type="dxa" w:w="6759"/>
+            <w:tcW w:type="dxa" w:w="6758"/>
             <w:tcBorders>
               <w:top w:val="single" w:color="000000" w:sz="4"/>
               <w:left w:val="single" w:color="000000" w:sz="4"/>
@@ -974,7 +974,7 @@
         </w:tc>
         <w:tc>
           <w:tcPr>
-            <w:tcW w:type="dxa" w:w="6759"/>
+            <w:tcW w:type="dxa" w:w="6758"/>
             <w:tcBorders>
               <w:top w:val="single" w:color="000000" w:sz="4"/>
               <w:left w:val="single" w:color="000000" w:sz="4"/>
@@ -1040,7 +1040,7 @@
         </w:tc>
         <w:tc>
           <w:tcPr>
-            <w:tcW w:type="dxa" w:w="6759"/>
+            <w:tcW w:type="dxa" w:w="6758"/>
             <w:tcBorders>
               <w:top w:val="single" w:color="000000" w:sz="4"/>
               <w:left w:val="single" w:color="000000" w:sz="4"/>
@@ -1106,7 +1106,7 @@
         </w:tc>
         <w:tc>
           <w:tcPr>
-            <w:tcW w:type="dxa" w:w="6759"/>
+            <w:tcW w:type="dxa" w:w="6758"/>
             <w:tcBorders>
               <w:top w:val="single" w:color="000000" w:sz="4"/>
               <w:left w:val="single" w:color="000000" w:sz="4"/>
@@ -1172,7 +1172,7 @@
         </w:tc>
         <w:tc>
           <w:tcPr>
-            <w:tcW w:type="dxa" w:w="6759"/>
+            <w:tcW w:type="dxa" w:w="6758"/>
             <w:tcBorders>
               <w:top w:val="single" w:color="000000" w:sz="4"/>
               <w:left w:val="single" w:color="000000" w:sz="4"/>
@@ -1238,7 +1238,7 @@
         </w:tc>
         <w:tc>
           <w:tcPr>
-            <w:tcW w:type="dxa" w:w="6759"/>
+            <w:tcW w:type="dxa" w:w="6758"/>
             <w:tcBorders>
               <w:top w:val="single" w:color="000000" w:sz="4"/>
               <w:left w:val="single" w:color="000000" w:sz="4"/>
@@ -1304,7 +1304,7 @@
         </w:tc>
         <w:tc>
           <w:tcPr>
-            <w:tcW w:type="dxa" w:w="6759"/>
+            <w:tcW w:type="dxa" w:w="6758"/>
             <w:tcBorders>
               <w:top w:val="single" w:color="000000" w:sz="4"/>
               <w:left w:val="single" w:color="000000" w:sz="4"/>
@@ -1697,7 +1697,7 @@
     </w:p>
     <w:tbl>
       <w:tblPr>
-        <w:tblW w:type="dxa" w:w="9759"/>
+        <w:tblW w:type="dxa" w:w="9758"/>
         <w:tblBorders>
           <w:top w:val="single" w:color="auto" w:sz="4"/>
           <w:left w:val="single" w:color="auto" w:sz="4"/>
@@ -1712,7 +1712,7 @@
         <w:gridCol w:w="2300"/>
         <w:gridCol w:w="1900"/>
         <w:gridCol w:w="1800"/>
-        <w:gridCol w:w="1759"/>
+        <w:gridCol w:w="1758"/>
       </w:tblGrid>
       <w:tr>
         <w:trPr>
@@ -1852,7 +1852,7 @@
         </w:tc>
         <w:tc>
           <w:tcPr>
-            <w:tcW w:type="dxa" w:w="1759"/>
+            <w:tcW w:type="dxa" w:w="1758"/>
             <w:tcBorders>
               <w:top w:val="single" w:color="000000" w:sz="4"/>
               <w:left w:val="single" w:color="000000" w:sz="4"/>
@@ -2015,7 +2015,7 @@
         </w:tc>
         <w:tc>
           <w:tcPr>
-            <w:tcW w:type="dxa" w:w="1759"/>
+            <w:tcW w:type="dxa" w:w="1758"/>
             <w:tcBorders>
               <w:top w:val="single" w:color="000000" w:sz="4"/>
               <w:left w:val="single" w:color="000000" w:sz="4"/>
@@ -2177,7 +2177,7 @@
         </w:tc>
         <w:tc>
           <w:tcPr>
-            <w:tcW w:type="dxa" w:w="1759"/>
+            <w:tcW w:type="dxa" w:w="1758"/>
             <w:tcBorders>
               <w:top w:val="single" w:color="000000" w:sz="4"/>
               <w:left w:val="single" w:color="000000" w:sz="4"/>
@@ -2339,7 +2339,7 @@
         </w:tc>
         <w:tc>
           <w:tcPr>
-            <w:tcW w:type="dxa" w:w="1759"/>
+            <w:tcW w:type="dxa" w:w="1758"/>
             <w:tcBorders>
               <w:top w:val="single" w:color="000000" w:sz="4"/>
               <w:left w:val="single" w:color="000000" w:sz="4"/>
@@ -11047,7 +11047,7 @@
     </w:p>
     <w:tbl>
       <w:tblPr>
-        <w:tblW w:type="dxa" w:w="9759"/>
+        <w:tblW w:type="dxa" w:w="9758"/>
         <w:tblBorders>
           <w:top w:val="single" w:color="auto" w:sz="4"/>
           <w:left w:val="single" w:color="auto" w:sz="4"/>
@@ -11060,7 +11060,7 @@
       <w:tblGrid>
         <w:gridCol w:w="4200"/>
         <w:gridCol w:w="2400"/>
-        <w:gridCol w:w="3159"/>
+        <w:gridCol w:w="3158"/>
       </w:tblGrid>
       <w:tr>
         <w:trPr>
@@ -11134,7 +11134,7 @@
         </w:tc>
         <w:tc>
           <w:tcPr>
-            <w:tcW w:type="dxa" w:w="3159"/>
+            <w:tcW w:type="dxa" w:w="3158"/>
             <w:tcBorders>
               <w:top w:val="single" w:color="000000" w:sz="4"/>
               <w:left w:val="single" w:color="000000" w:sz="4"/>
@@ -11233,7 +11233,7 @@
         </w:tc>
         <w:tc>
           <w:tcPr>
-            <w:tcW w:type="dxa" w:w="3159"/>
+            <w:tcW w:type="dxa" w:w="3158"/>
             <w:tcBorders>
               <w:top w:val="single" w:color="000000" w:sz="4"/>
               <w:left w:val="single" w:color="000000" w:sz="4"/>
@@ -11331,7 +11331,7 @@
         </w:tc>
         <w:tc>
           <w:tcPr>
-            <w:tcW w:type="dxa" w:w="3159"/>
+            <w:tcW w:type="dxa" w:w="3158"/>
             <w:tcBorders>
               <w:top w:val="single" w:color="000000" w:sz="4"/>
               <w:left w:val="single" w:color="000000" w:sz="4"/>
@@ -11429,7 +11429,7 @@
         </w:tc>
         <w:tc>
           <w:tcPr>
-            <w:tcW w:type="dxa" w:w="3159"/>
+            <w:tcW w:type="dxa" w:w="3158"/>
             <w:tcBorders>
               <w:top w:val="single" w:color="000000" w:sz="4"/>
               <w:left w:val="single" w:color="000000" w:sz="4"/>
@@ -11527,7 +11527,7 @@
         </w:tc>
         <w:tc>
           <w:tcPr>
-            <w:tcW w:type="dxa" w:w="3159"/>
+            <w:tcW w:type="dxa" w:w="3158"/>
             <w:tcBorders>
               <w:top w:val="single" w:color="000000" w:sz="4"/>
               <w:left w:val="single" w:color="000000" w:sz="4"/>
@@ -11625,7 +11625,7 @@
         </w:tc>
         <w:tc>
           <w:tcPr>
-            <w:tcW w:type="dxa" w:w="3159"/>
+            <w:tcW w:type="dxa" w:w="3158"/>
             <w:tcBorders>
               <w:top w:val="single" w:color="000000" w:sz="4"/>
               <w:left w:val="single" w:color="000000" w:sz="4"/>
@@ -12713,7 +12713,7 @@
     <w:sectPr>
       <w:footerReference w:type="default" r:id="rId6"/>
       <w:pgSz w:w="11906" w:h="16838" w:orient="portrait"/>
-      <w:pgMar w:top="523" w:right="707" w:bottom="730" w:left="1440" w:header="0" w:footer="300" w:gutter="0"/>
+      <w:pgMar w:top="523" w:right="1074" w:bottom="730" w:left="1074" w:header="0" w:footer="300" w:gutter="0"/>
       <w:pgNumType/>
       <w:docGrid w:linePitch="360"/>
     </w:sectPr>

</xml_diff>